<commit_message>
Auto sync: Dữ liệu USDA Acreage mới
</commit_message>
<xml_diff>
--- a/Daily Reports/04_09_2026-CBOT Reports.docx
+++ b/Daily Reports/04_09_2026-CBOT Reports.docx
@@ -104,7 +104,7 @@
           <w:color w:val="5C768D"/>
           <w:sz w:val="19"/>
         </w:rPr>
-        <w:t>Cập nhật tự động qua `macro_tracker.py` vào lúc 06:00 ICT ngày 04/09/2026</w:t>
+        <w:t>Cập nhật tự động qua `macro_tracker.py` vào lúc 06:32 ICT ngày 04/09/2026</w:t>
       </w:r>
     </w:p>
     <w:tbl>
@@ -313,7 +313,7 @@
               <w:rPr>
                 <w:b/>
               </w:rPr>
-              <w:t>95.82 / thùng</w:t>
+              <w:t>95.93 / thùng</w:t>
             </w:r>
           </w:p>
         </w:tc>
@@ -344,7 +344,7 @@
               <w:rPr>
                 <w:b/>
               </w:rPr>
-              <w:t>+0.20%</w:t>
+              <w:t>+0.31%</w:t>
             </w:r>
           </w:p>
         </w:tc>
@@ -1228,7 +1228,7 @@
         <w:rPr>
           <w:b/>
         </w:rPr>
-        <w:t>`95.82` (+0.20%)</w:t>
+        <w:t>`95.93` (+0.31%)</w:t>
       </w:r>
       <w:r>
         <w:t xml:space="preserve"> | DXY: </w:t>
@@ -1316,7 +1316,7 @@
           <w:color w:val="5C768D"/>
           <w:sz w:val="19"/>
         </w:rPr>
-        <w:t>Cập nhật tự động lúc 06:00 ICT ngày 04/09/2026 — Nguồn: NOAA, USDA, BOM Australia</w:t>
+        <w:t>Cập nhật tự động lúc 06:32 ICT ngày 04/09/2026 — Nguồn: NOAA, USDA, BOM Australia</w:t>
       </w:r>
     </w:p>
     <w:p>
@@ -3615,7 +3615,7 @@
               <w:rPr>
                 <w:b/>
               </w:rPr>
-              <w:t>541.42 (+2.17)</w:t>
+              <w:t>541.45 (+2.20)</w:t>
             </w:r>
           </w:p>
         </w:tc>
@@ -11624,10 +11624,10 @@
         <w:rPr>
           <w:b/>
         </w:rPr>
-        <w:t>`541.42 cents`</w:t>
+        <w:t>`541.45 cents`</w:t>
       </w:r>
       <w:r>
-        <w:t xml:space="preserve"> (+2.17).</w:t>
+        <w:t xml:space="preserve"> (+2.20).</w:t>
       </w:r>
     </w:p>
     <w:p>
@@ -11991,7 +11991,7 @@
               <w:rPr>
                 <w:b/>
               </w:rPr>
-              <w:t>95.82</w:t>
+              <w:t>95.93</w:t>
             </w:r>
           </w:p>
         </w:tc>
@@ -12022,7 +12022,7 @@
               <w:rPr>
                 <w:b/>
               </w:rPr>
-              <w:t>+0.20%</w:t>
+              <w:t>+0.31%</w:t>
             </w:r>
           </w:p>
         </w:tc>
@@ -22173,7 +22173,7 @@
               <w:rPr>
                 <w:b/>
               </w:rPr>
-              <w:t>95.82</w:t>
+              <w:t>95.93</w:t>
             </w:r>
           </w:p>
         </w:tc>
@@ -22204,7 +22204,7 @@
               <w:rPr>
                 <w:b/>
               </w:rPr>
-              <w:t>+0.20%</w:t>
+              <w:t>+0.31%</w:t>
             </w:r>
           </w:p>
         </w:tc>

</xml_diff>